<commit_message>
modified:   Documentatie website informatica.docx 	modified:   Hobbies.html 	modified:   Hobbiesin.html 	modified:   Home.html 	modified:   IHK.html 	modified:   Luisteren.html 	modified:   Nieuws.html 	modified:   index.html
</commit_message>
<xml_diff>
--- a/Documentatie website informatica.docx
+++ b/Documentatie website informatica.docx
@@ -7,11 +7,532 @@
         <w:pStyle w:val="Titel"/>
       </w:pPr>
       <w:r>
-        <w:t>Documentatie website informatica:</w:t>
+        <w:t>Documentatie</w:t>
+      </w:r>
+    </w:p>
+    <w:p>
+      <w:pPr>
+        <w:pStyle w:val="Ondertitel"/>
+      </w:pPr>
+      <w:r>
+        <w:t xml:space="preserve">Voor informatica: de </w:t>
+      </w:r>
+      <w:r>
+        <w:t>webpagina</w:t>
+      </w:r>
+      <w:r>
+        <w:t xml:space="preserve"> over jezelf</w:t>
+      </w:r>
+    </w:p>
+    <w:p/>
+    <w:p/>
+    <w:p/>
+    <w:p>
+      <w:pPr>
+        <w:rPr>
+          <w:b/>
+          <w:bCs/>
+        </w:rPr>
+      </w:pPr>
+      <w:r>
+        <w:rPr>
+          <w:b/>
+          <w:bCs/>
+        </w:rPr>
+        <w:t xml:space="preserve">Gemaakt door: </w:t>
+      </w:r>
+      <w:r>
+        <w:rPr>
+          <w:b/>
+          <w:bCs/>
+        </w:rPr>
+        <w:tab/>
+      </w:r>
+      <w:r>
+        <w:rPr>
+          <w:b/>
+          <w:bCs/>
+        </w:rPr>
+        <w:tab/>
+        <w:t>Rico Mourik</w:t>
+      </w:r>
+    </w:p>
+    <w:p>
+      <w:pPr>
+        <w:rPr>
+          <w:b/>
+          <w:bCs/>
+        </w:rPr>
+      </w:pPr>
+      <w:r>
+        <w:rPr>
+          <w:b/>
+          <w:bCs/>
+        </w:rPr>
+        <w:t>Uit:</w:t>
+      </w:r>
+      <w:r>
+        <w:rPr>
+          <w:b/>
+          <w:bCs/>
+        </w:rPr>
+        <w:tab/>
+      </w:r>
+      <w:r>
+        <w:rPr>
+          <w:b/>
+          <w:bCs/>
+        </w:rPr>
+        <w:tab/>
+      </w:r>
+      <w:r>
+        <w:rPr>
+          <w:b/>
+          <w:bCs/>
+        </w:rPr>
+        <w:tab/>
+        <w:t>V4A</w:t>
+      </w:r>
+    </w:p>
+    <w:p>
+      <w:pPr>
+        <w:rPr>
+          <w:b/>
+          <w:bCs/>
+        </w:rPr>
+      </w:pPr>
+      <w:r>
+        <w:rPr>
+          <w:b/>
+          <w:bCs/>
+        </w:rPr>
+        <w:t xml:space="preserve">Met docent: </w:t>
+      </w:r>
+      <w:r>
+        <w:rPr>
+          <w:b/>
+          <w:bCs/>
+        </w:rPr>
+        <w:tab/>
+      </w:r>
+      <w:r>
+        <w:rPr>
+          <w:b/>
+          <w:bCs/>
+        </w:rPr>
+        <w:tab/>
+        <w:t>Meneer Haksteen</w:t>
+      </w:r>
+      <w:r>
+        <w:rPr>
+          <w:b/>
+          <w:bCs/>
+        </w:rPr>
+        <w:br/>
+      </w:r>
+    </w:p>
+    <w:p>
+      <w:pPr>
+        <w:rPr>
+          <w:b/>
+          <w:bCs/>
+        </w:rPr>
+      </w:pPr>
+      <w:r>
+        <w:rPr>
+          <w:b/>
+          <w:bCs/>
+        </w:rPr>
+        <w:br w:type="page"/>
+      </w:r>
+    </w:p>
+    <w:sdt>
+      <w:sdtPr>
+        <w:id w:val="564065681"/>
+        <w:docPartObj>
+          <w:docPartGallery w:val="Table of Contents"/>
+          <w:docPartUnique/>
+        </w:docPartObj>
+      </w:sdtPr>
+      <w:sdtEndPr>
+        <w:rPr>
+          <w:rFonts w:asciiTheme="minorHAnsi" w:eastAsiaTheme="minorEastAsia" w:hAnsiTheme="minorHAnsi" w:cstheme="minorBidi"/>
+          <w:b/>
+          <w:bCs/>
+          <w:color w:val="auto"/>
+          <w:sz w:val="21"/>
+          <w:szCs w:val="21"/>
+        </w:rPr>
+      </w:sdtEndPr>
+      <w:sdtContent>
+        <w:p>
+          <w:pPr>
+            <w:pStyle w:val="Kopvaninhoudsopgave"/>
+          </w:pPr>
+          <w:r>
+            <w:t>Inhoudsopgave</w:t>
+          </w:r>
+        </w:p>
+        <w:p>
+          <w:pPr>
+            <w:pStyle w:val="Inhopg1"/>
+            <w:tabs>
+              <w:tab w:val="right" w:leader="dot" w:pos="9062"/>
+            </w:tabs>
+            <w:rPr>
+              <w:noProof/>
+            </w:rPr>
+          </w:pPr>
+          <w:r>
+            <w:fldChar w:fldCharType="begin"/>
+          </w:r>
+          <w:r>
+            <w:instrText xml:space="preserve"> TOC \o "1-3" \h \z \u </w:instrText>
+          </w:r>
+          <w:r>
+            <w:fldChar w:fldCharType="separate"/>
+          </w:r>
+          <w:hyperlink w:anchor="_Toc231681858" w:history="1">
+            <w:r>
+              <w:rPr>
+                <w:rStyle w:val="Hyperlink"/>
+                <w:noProof/>
+              </w:rPr>
+              <w:t>Inleiding</w:t>
+            </w:r>
+            <w:r>
+              <w:rPr>
+                <w:noProof/>
+                <w:webHidden/>
+              </w:rPr>
+              <w:tab/>
+            </w:r>
+            <w:r>
+              <w:rPr>
+                <w:noProof/>
+                <w:webHidden/>
+              </w:rPr>
+              <w:fldChar w:fldCharType="begin"/>
+            </w:r>
+            <w:r>
+              <w:rPr>
+                <w:noProof/>
+                <w:webHidden/>
+              </w:rPr>
+              <w:instrText xml:space="preserve"> PAGEREF _Toc231681858 \h </w:instrText>
+            </w:r>
+            <w:r>
+              <w:rPr>
+                <w:noProof/>
+                <w:webHidden/>
+              </w:rPr>
+            </w:r>
+            <w:r>
+              <w:rPr>
+                <w:noProof/>
+                <w:webHidden/>
+              </w:rPr>
+              <w:fldChar w:fldCharType="separate"/>
+            </w:r>
+            <w:r>
+              <w:rPr>
+                <w:noProof/>
+                <w:webHidden/>
+              </w:rPr>
+              <w:t>3</w:t>
+            </w:r>
+            <w:r>
+              <w:rPr>
+                <w:noProof/>
+                <w:webHidden/>
+              </w:rPr>
+              <w:fldChar w:fldCharType="end"/>
+            </w:r>
+          </w:hyperlink>
+        </w:p>
+        <w:p>
+          <w:r>
+            <w:rPr>
+              <w:b/>
+              <w:bCs/>
+            </w:rPr>
+            <w:fldChar w:fldCharType="end"/>
+          </w:r>
+        </w:p>
+      </w:sdtContent>
+    </w:sdt>
+    <w:p>
+      <w:pPr>
+        <w:rPr>
+          <w:rFonts w:asciiTheme="majorHAnsi" w:eastAsiaTheme="majorEastAsia" w:hAnsiTheme="majorHAnsi" w:cstheme="majorBidi"/>
+          <w:color w:val="2F5496" w:themeColor="accent1" w:themeShade="BF"/>
+          <w:sz w:val="40"/>
+          <w:szCs w:val="40"/>
+        </w:rPr>
+      </w:pPr>
+      <w:r>
+        <w:br w:type="page"/>
+      </w:r>
+    </w:p>
+    <w:p>
+      <w:pPr>
+        <w:pStyle w:val="Kop1"/>
+      </w:pPr>
+      <w:bookmarkStart w:id="0" w:name="_Toc231681858"/>
+      <w:r>
+        <w:lastRenderedPageBreak/>
+        <w:t>Inleiding</w:t>
+      </w:r>
+      <w:bookmarkEnd w:id="0"/>
+    </w:p>
+    <w:p>
+      <w:r>
+        <w:t>In de afgelopen tijd heb ik gewerkt aan een website over mijzelf</w:t>
+      </w:r>
+      <w:r>
+        <w:t xml:space="preserve">. Na heel wat tijd erin gestoken te hebben, is de website nu af en lever ik hierbij een korte documentatie. </w:t>
+      </w:r>
+    </w:p>
+    <w:p>
+      <w:pPr>
+        <w:rPr>
+          <w:rFonts w:asciiTheme="majorHAnsi" w:eastAsiaTheme="majorEastAsia" w:hAnsiTheme="majorHAnsi" w:cstheme="majorBidi"/>
+          <w:color w:val="2F5496" w:themeColor="accent1" w:themeShade="BF"/>
+          <w:sz w:val="40"/>
+          <w:szCs w:val="40"/>
+        </w:rPr>
+      </w:pPr>
+      <w:r>
+        <w:br w:type="page"/>
+      </w:r>
+    </w:p>
+    <w:p>
+      <w:pPr>
+        <w:pStyle w:val="Kop1"/>
+      </w:pPr>
+      <w:r>
+        <w:lastRenderedPageBreak/>
+        <w:t>Opbouw</w:t>
+      </w:r>
+    </w:p>
+    <w:p>
+      <w:r>
+        <w:t>Ik ben begonnen met een thema te kiezen voor de website: Lego</w:t>
+      </w:r>
+      <w:r>
+        <w:t xml:space="preserve">. Dit zie je op ieder pagina terug, bij de achtergrond, de navigatie, enz. </w:t>
+      </w:r>
+      <w:r>
+        <w:t xml:space="preserve">Ik heb er ook voor gekozen om verschillende </w:t>
+      </w:r>
+      <w:proofErr w:type="spellStart"/>
+      <w:r>
+        <w:t>iframes</w:t>
+      </w:r>
+      <w:proofErr w:type="spellEnd"/>
+      <w:r>
+        <w:t xml:space="preserve"> te gebruiken, omdat ik dat handig en mooi vind. </w:t>
+      </w:r>
+      <w:r>
+        <w:t xml:space="preserve">Toen heb ik veel </w:t>
+      </w:r>
+      <w:r>
+        <w:t xml:space="preserve">styling gedaan met de aparte CSS file en heb ik </w:t>
+      </w:r>
+      <w:r>
+        <w:t>de teksten toegevoegd</w:t>
+      </w:r>
+      <w:r>
+        <w:t xml:space="preserve"> bij ‘in het kort’ en ‘</w:t>
+      </w:r>
+      <w:r>
+        <w:t>hobby’s</w:t>
+      </w:r>
+      <w:r>
+        <w:t xml:space="preserve">’. </w:t>
+      </w:r>
+      <w:r>
+        <w:t xml:space="preserve">Later heb ik de beveiliging toegevoegd bij hobby’s en vooral gewerkt met javascript, ook om de nieuwspagina in te richten. Ik heb voor dat laatste eigenlijk gebruik gemaakt van een </w:t>
+      </w:r>
+      <w:r>
+        <w:t xml:space="preserve">‘opslag’ voor de data en daar de tekst vandaan gehaald om te gebruiken in </w:t>
+      </w:r>
+      <w:r>
+        <w:t>HTML</w:t>
+      </w:r>
+      <w:r>
+        <w:t xml:space="preserve">. </w:t>
+      </w:r>
+      <w:r>
+        <w:t>De styling heb ik daarvoor ook weer met CSS gedaan en</w:t>
+      </w:r>
+      <w:r>
+        <w:t xml:space="preserve"> ik heb zelfs een beetje javascript in de HTML van nieuws gezet, omdat dat makkelijker was. Ook hier heb ik weer een </w:t>
+      </w:r>
+      <w:proofErr w:type="spellStart"/>
+      <w:r>
+        <w:t>iframe</w:t>
+      </w:r>
+      <w:proofErr w:type="spellEnd"/>
+      <w:r>
+        <w:t xml:space="preserve"> gebruikt als je</w:t>
+      </w:r>
+      <w:r>
+        <w:t xml:space="preserve"> het ‘nieuws artikel’ opent.</w:t>
+      </w:r>
+      <w:r>
+        <w:t xml:space="preserve"> Deze pagina vond ik het leukst om te</w:t>
+      </w:r>
+      <w:r>
+        <w:t xml:space="preserve"> </w:t>
+      </w:r>
+      <w:r>
+        <w:t xml:space="preserve">maken, omdat hier veel javascript en styling bij kwam kijken. </w:t>
+      </w:r>
+      <w:r>
+        <w:t xml:space="preserve">Bij luisteren heb ik van </w:t>
+      </w:r>
+      <w:proofErr w:type="spellStart"/>
+      <w:r>
+        <w:t>S</w:t>
+      </w:r>
+      <w:r>
+        <w:t>potify</w:t>
+      </w:r>
+      <w:proofErr w:type="spellEnd"/>
+      <w:r>
+        <w:t xml:space="preserve"> code gebruikt en aangepast om de </w:t>
+      </w:r>
+      <w:proofErr w:type="spellStart"/>
+      <w:r>
+        <w:t>iframes</w:t>
+      </w:r>
+      <w:proofErr w:type="spellEnd"/>
+      <w:r>
+        <w:t xml:space="preserve"> met nummers </w:t>
+      </w:r>
+      <w:r>
+        <w:t xml:space="preserve">in de webpagina te verwerken. Daaronder heb ik de filmpjes toegevoegd, omdat er een restrictie was voor beeldmateriaal en ik nog leuke filmpjes had om te gebruiken. </w:t>
+      </w:r>
+    </w:p>
+    <w:p>
+      <w:r>
+        <w:t xml:space="preserve">De CSS vond ik het moeilijkst, omdat ik daar het minst vertrouwd mee was en niet heel duidelijk wist wat ik wilde, </w:t>
+      </w:r>
+      <w:r>
+        <w:t xml:space="preserve">bijvoorbeeld of ik een afbeelding een absolute of relatieve positie moest geven. De moeilijkheid lag vooral bij het feit dat de webpagina moet werken bij verschillende schermgroottes. </w:t>
+      </w:r>
+      <w:r>
+        <w:t>Maar volgens mij is dat uiteindelijk met verschillende ‘</w:t>
+      </w:r>
+      <w:proofErr w:type="spellStart"/>
+      <w:r>
+        <w:t>flex</w:t>
+      </w:r>
+      <w:proofErr w:type="spellEnd"/>
+      <w:r>
+        <w:t xml:space="preserve">’ onderdelen gelukt. </w:t>
+      </w:r>
+    </w:p>
+    <w:p>
+      <w:r>
+        <w:t xml:space="preserve">De </w:t>
+      </w:r>
+      <w:proofErr w:type="spellStart"/>
+      <w:r>
+        <w:t>JavaScript</w:t>
+      </w:r>
+      <w:proofErr w:type="spellEnd"/>
+      <w:r>
+        <w:t xml:space="preserve"> vond ik ook niet makkelijk, maar ook niet moeilijk. Ik heb wel vaker al met python en een klein beetje met </w:t>
+      </w:r>
+      <w:proofErr w:type="spellStart"/>
+      <w:r>
+        <w:t>JavaScript</w:t>
+      </w:r>
+      <w:proofErr w:type="spellEnd"/>
+      <w:r>
+        <w:t xml:space="preserve"> gewerkt, dus de gedachtegang die je daarvoor nodig hebt, heb ik wel een beetje. Alleen soms de uitvoering is lastig, zeker omdat ik weet wat ik wil en hoe dat moet, maar je soms niet precies weet hoe je dat goed neergezet krijgt. </w:t>
+      </w:r>
+    </w:p>
+    <w:p>
+      <w:r>
+        <w:t xml:space="preserve">Het zou dus kunnen dat ik overbodig moeilijke dingen heb gedaan voor een makkelijker probleem, maar ik heb het naar mijn idee simpel gehouden. </w:t>
+      </w:r>
+      <w:r>
+        <w:t xml:space="preserve">Er kunnen ook dus fouten inzitten, maar de code werkt en de webpagina doet het, dus voor mijn eerste echte webpagina ben ik tevreden. </w:t>
+      </w:r>
+      <w:r>
+        <w:t xml:space="preserve"> </w:t>
+      </w:r>
+    </w:p>
+    <w:p>
+      <w:r>
+        <w:br w:type="page"/>
+      </w:r>
+    </w:p>
+    <w:p>
+      <w:pPr>
+        <w:pStyle w:val="Kop1"/>
+      </w:pPr>
+      <w:r>
+        <w:lastRenderedPageBreak/>
+        <w:t>Hulpmiddelen</w:t>
+      </w:r>
+    </w:p>
+    <w:p>
+      <w:r>
+        <w:t>Ik heb verschillende hulpmiddelen gebruikt bij het maken van de website, hieronder genoemd:</w:t>
+      </w:r>
+    </w:p>
+    <w:p>
+      <w:pPr>
+        <w:pStyle w:val="Lijstalinea"/>
+        <w:numPr>
+          <w:ilvl w:val="0"/>
+          <w:numId w:val="1"/>
+        </w:numPr>
+      </w:pPr>
+      <w:r>
+        <w:t>De verschillende gegeven modules</w:t>
+      </w:r>
+      <w:r>
+        <w:t>, voor een basis en wat uitleg</w:t>
+      </w:r>
+    </w:p>
+    <w:p>
+      <w:pPr>
+        <w:pStyle w:val="Lijstalinea"/>
+        <w:numPr>
+          <w:ilvl w:val="0"/>
+          <w:numId w:val="1"/>
+        </w:numPr>
+      </w:pPr>
+      <w:r>
+        <w:t>W3Schools, voor extra uitleg op bepaalde vlakken</w:t>
+      </w:r>
+    </w:p>
+    <w:p>
+      <w:pPr>
+        <w:pStyle w:val="Lijstalinea"/>
+        <w:numPr>
+          <w:ilvl w:val="0"/>
+          <w:numId w:val="1"/>
+        </w:numPr>
+      </w:pPr>
+      <w:r>
+        <w:t xml:space="preserve">De agent in VS code, </w:t>
+      </w:r>
+      <w:r>
+        <w:t>voor als ik echt even niet wist hoe ik iets moest aanpakken en daarmee extra uitleg nodig had</w:t>
+      </w:r>
+      <w:r>
+        <w:t>.</w:t>
       </w:r>
     </w:p>
     <w:p/>
     <w:sectPr>
+      <w:footerReference w:type="default" r:id="rId7"/>
       <w:pgSz w:w="11906" w:h="16838"/>
       <w:pgMar w:top="1417" w:right="1417" w:bottom="1417" w:left="1417" w:header="708" w:footer="708" w:gutter="0"/>
       <w:cols w:space="708"/>
@@ -21,20 +542,367 @@
 </w:document>
 </file>
 
+<file path=word/endnotes.xml><?xml version="1.0" encoding="utf-8"?>
+<w:endnotes xmlns:wpc="http://schemas.microsoft.com/office/word/2010/wordprocessingCanvas" xmlns:cx="http://schemas.microsoft.com/office/drawing/2014/chartex" xmlns:cx1="http://schemas.microsoft.com/office/drawing/2015/9/8/chartex" xmlns:cx2="http://schemas.microsoft.com/office/drawing/2015/10/21/chartex" xmlns:cx3="http://schemas.microsoft.com/office/drawing/2016/5/9/chartex" xmlns:cx4="http://schemas.microsoft.com/office/drawing/2016/5/10/chartex" xmlns:cx5="http://schemas.microsoft.com/office/drawing/2016/5/11/chartex" xmlns:cx6="http://schemas.microsoft.com/office/drawing/2016/5/12/chartex" xmlns:cx7="http://schemas.microsoft.com/office/drawing/2016/5/13/chartex" xmlns:cx8="http://schemas.microsoft.com/office/drawing/2016/5/14/chartex" xmlns:mc="http://schemas.openxmlformats.org/markup-compatibility/2006" xmlns:aink="http://schemas.microsoft.com/office/drawing/2016/ink" xmlns:am3d="http://schemas.microsoft.com/office/drawing/2017/model3d" xmlns:o="urn:schemas-microsoft-com:office:office" xmlns:r="http://schemas.openxmlformats.org/officeDocument/2006/relationships" xmlns:m="http://schemas.openxmlformats.org/officeDocument/2006/math" xmlns:v="urn:schemas-microsoft-com:vml" xmlns:wp14="http://schemas.microsoft.com/office/word/2010/wordprocessingDrawing" xmlns:wp="http://schemas.openxmlformats.org/drawingml/2006/wordprocessingDrawing" xmlns:w10="urn:schemas-microsoft-com:office:word" xmlns:w="http://schemas.openxmlformats.org/wordprocessingml/2006/main" xmlns:w14="http://schemas.microsoft.com/office/word/2010/wordml" xmlns:w15="http://schemas.microsoft.com/office/word/2012/wordml" xmlns:w16cex="http://schemas.microsoft.com/office/word/2018/wordml/cex" xmlns:w16cid="http://schemas.microsoft.com/office/word/2016/wordml/cid" xmlns:w16="http://schemas.microsoft.com/office/word/2018/wordml" xmlns:w16sdtdh="http://schemas.microsoft.com/office/word/2020/wordml/sdtdatahash" xmlns:w16se="http://schemas.microsoft.com/office/word/2015/wordml/symex" xmlns:wpg="http://schemas.microsoft.com/office/word/2010/wordprocessingGroup" xmlns:wpi="http://schemas.microsoft.com/office/word/2010/wordprocessingInk" xmlns:wne="http://schemas.microsoft.com/office/word/2006/wordml" xmlns:wps="http://schemas.microsoft.com/office/word/2010/wordprocessingShape" mc:Ignorable="w14 w15 w16se w16cid w16 w16cex w16sdtdh wp14">
+  <w:endnote w:type="separator" w:id="-1">
+    <w:p>
+      <w:pPr>
+        <w:spacing w:after="0" w:line="240" w:lineRule="auto"/>
+      </w:pPr>
+      <w:r>
+        <w:separator/>
+      </w:r>
+    </w:p>
+  </w:endnote>
+  <w:endnote w:type="continuationSeparator" w:id="0">
+    <w:p>
+      <w:pPr>
+        <w:spacing w:after="0" w:line="240" w:lineRule="auto"/>
+      </w:pPr>
+      <w:r>
+        <w:continuationSeparator/>
+      </w:r>
+    </w:p>
+  </w:endnote>
+</w:endnotes>
+</file>
+
+<file path=word/footer1.xml><?xml version="1.0" encoding="utf-8"?>
+<w:ftr xmlns:wpc="http://schemas.microsoft.com/office/word/2010/wordprocessingCanvas" xmlns:cx="http://schemas.microsoft.com/office/drawing/2014/chartex" xmlns:cx1="http://schemas.microsoft.com/office/drawing/2015/9/8/chartex" xmlns:cx2="http://schemas.microsoft.com/office/drawing/2015/10/21/chartex" xmlns:cx3="http://schemas.microsoft.com/office/drawing/2016/5/9/chartex" xmlns:cx4="http://schemas.microsoft.com/office/drawing/2016/5/10/chartex" xmlns:cx5="http://schemas.microsoft.com/office/drawing/2016/5/11/chartex" xmlns:cx6="http://schemas.microsoft.com/office/drawing/2016/5/12/chartex" xmlns:cx7="http://schemas.microsoft.com/office/drawing/2016/5/13/chartex" xmlns:cx8="http://schemas.microsoft.com/office/drawing/2016/5/14/chartex" xmlns:mc="http://schemas.openxmlformats.org/markup-compatibility/2006" xmlns:aink="http://schemas.microsoft.com/office/drawing/2016/ink" xmlns:am3d="http://schemas.microsoft.com/office/drawing/2017/model3d" xmlns:o="urn:schemas-microsoft-com:office:office" xmlns:r="http://schemas.openxmlformats.org/officeDocument/2006/relationships" xmlns:m="http://schemas.openxmlformats.org/officeDocument/2006/math" xmlns:v="urn:schemas-microsoft-com:vml" xmlns:wp14="http://schemas.microsoft.com/office/word/2010/wordprocessingDrawing" xmlns:wp="http://schemas.openxmlformats.org/drawingml/2006/wordprocessingDrawing" xmlns:w10="urn:schemas-microsoft-com:office:word" xmlns:w="http://schemas.openxmlformats.org/wordprocessingml/2006/main" xmlns:w14="http://schemas.microsoft.com/office/word/2010/wordml" xmlns:w15="http://schemas.microsoft.com/office/word/2012/wordml" xmlns:w16cex="http://schemas.microsoft.com/office/word/2018/wordml/cex" xmlns:w16cid="http://schemas.microsoft.com/office/word/2016/wordml/cid" xmlns:w16="http://schemas.microsoft.com/office/word/2018/wordml" xmlns:w16sdtdh="http://schemas.microsoft.com/office/word/2020/wordml/sdtdatahash" xmlns:w16se="http://schemas.microsoft.com/office/word/2015/wordml/symex" xmlns:wpg="http://schemas.microsoft.com/office/word/2010/wordprocessingGroup" xmlns:wpi="http://schemas.microsoft.com/office/word/2010/wordprocessingInk" xmlns:wne="http://schemas.microsoft.com/office/word/2006/wordml" xmlns:wps="http://schemas.microsoft.com/office/word/2010/wordprocessingShape" mc:Ignorable="w14 w15 w16se w16cid w16 w16cex w16sdtdh wp14">
+  <w:sdt>
+    <w:sdtPr>
+      <w:id w:val="-1943139162"/>
+      <w:docPartObj>
+        <w:docPartGallery w:val="Page Numbers (Bottom of Page)"/>
+        <w:docPartUnique/>
+      </w:docPartObj>
+    </w:sdtPr>
+    <w:sdtContent>
+      <w:p>
+        <w:pPr>
+          <w:pStyle w:val="Voettekst"/>
+        </w:pPr>
+        <w:r>
+          <w:rPr>
+            <w:noProof/>
+          </w:rPr>
+          <mc:AlternateContent>
+            <mc:Choice Requires="wps">
+              <w:drawing>
+                <wp:anchor distT="0" distB="0" distL="114300" distR="114300" simplePos="0" relativeHeight="251659264" behindDoc="0" locked="0" layoutInCell="1" allowOverlap="1" wp14:anchorId="016DEF77" wp14:editId="5FF603F5">
+                  <wp:simplePos x="0" y="0"/>
+                  <wp:positionH relativeFrom="rightMargin">
+                    <wp:align>center</wp:align>
+                  </wp:positionH>
+                  <wp:positionV relativeFrom="bottomMargin">
+                    <wp:align>center</wp:align>
+                  </wp:positionV>
+                  <wp:extent cx="565785" cy="191770"/>
+                  <wp:effectExtent l="0" t="0" r="0" b="0"/>
+                  <wp:wrapNone/>
+                  <wp:docPr id="1" name="Rechthoek 1"/>
+                  <wp:cNvGraphicFramePr>
+                    <a:graphicFrameLocks xmlns:a="http://schemas.openxmlformats.org/drawingml/2006/main"/>
+                  </wp:cNvGraphicFramePr>
+                  <a:graphic xmlns:a="http://schemas.openxmlformats.org/drawingml/2006/main">
+                    <a:graphicData uri="http://schemas.microsoft.com/office/word/2010/wordprocessingShape">
+                      <wps:wsp>
+                        <wps:cNvSpPr>
+                          <a:spLocks noChangeArrowheads="1"/>
+                        </wps:cNvSpPr>
+                        <wps:spPr bwMode="auto">
+                          <a:xfrm rot="10800000" flipH="1">
+                            <a:off x="0" y="0"/>
+                            <a:ext cx="565785" cy="191770"/>
+                          </a:xfrm>
+                          <a:prstGeom prst="rect">
+                            <a:avLst/>
+                          </a:prstGeom>
+                          <a:noFill/>
+                          <a:ln>
+                            <a:noFill/>
+                          </a:ln>
+                          <a:extLst>
+                            <a:ext uri="{909E8E84-426E-40DD-AFC4-6F175D3DCCD1}">
+                              <a14:hiddenFill xmlns:a14="http://schemas.microsoft.com/office/drawing/2010/main">
+                                <a:solidFill>
+                                  <a:srgbClr val="C0504D"/>
+                                </a:solidFill>
+                              </a14:hiddenFill>
+                            </a:ext>
+                            <a:ext uri="{91240B29-F687-4F45-9708-019B960494DF}">
+                              <a14:hiddenLine xmlns:a14="http://schemas.microsoft.com/office/drawing/2010/main" w="28575">
+                                <a:solidFill>
+                                  <a:srgbClr val="5C83B4"/>
+                                </a:solidFill>
+                                <a:miter lim="800000"/>
+                                <a:headEnd/>
+                                <a:tailEnd/>
+                              </a14:hiddenLine>
+                            </a:ext>
+                          </a:extLst>
+                        </wps:spPr>
+                        <wps:txbx>
+                          <w:txbxContent>
+                            <w:p>
+                              <w:pPr>
+                                <w:pBdr>
+                                  <w:top w:val="single" w:sz="4" w:space="1" w:color="7F7F7F" w:themeColor="background1" w:themeShade="7F"/>
+                                </w:pBdr>
+                                <w:jc w:val="center"/>
+                                <w:rPr>
+                                  <w:color w:val="ED7D31" w:themeColor="accent2"/>
+                                </w:rPr>
+                              </w:pPr>
+                              <w:r>
+                                <w:fldChar w:fldCharType="begin"/>
+                              </w:r>
+                              <w:r>
+                                <w:instrText>PAGE   \* MERGEFORMAT</w:instrText>
+                              </w:r>
+                              <w:r>
+                                <w:fldChar w:fldCharType="separate"/>
+                              </w:r>
+                              <w:r>
+                                <w:rPr>
+                                  <w:color w:val="ED7D31" w:themeColor="accent2"/>
+                                </w:rPr>
+                                <w:t>2</w:t>
+                              </w:r>
+                              <w:r>
+                                <w:rPr>
+                                  <w:color w:val="ED7D31" w:themeColor="accent2"/>
+                                </w:rPr>
+                                <w:fldChar w:fldCharType="end"/>
+                              </w:r>
+                            </w:p>
+                          </w:txbxContent>
+                        </wps:txbx>
+                        <wps:bodyPr rot="0" vert="horz" wrap="square" lIns="91440" tIns="0" rIns="91440" bIns="0" anchor="t" anchorCtr="0" upright="1">
+                          <a:noAutofit/>
+                        </wps:bodyPr>
+                      </wps:wsp>
+                    </a:graphicData>
+                  </a:graphic>
+                  <wp14:sizeRelH relativeFrom="page">
+                    <wp14:pctWidth>0</wp14:pctWidth>
+                  </wp14:sizeRelH>
+                  <wp14:sizeRelV relativeFrom="bottomMargin">
+                    <wp14:pctHeight>0</wp14:pctHeight>
+                  </wp14:sizeRelV>
+                </wp:anchor>
+              </w:drawing>
+            </mc:Choice>
+            <mc:Fallback>
+              <w:pict>
+                <v:rect w14:anchorId="016DEF77" id="Rechthoek 1" o:spid="_x0000_s1026" style="position:absolute;margin-left:0;margin-top:0;width:44.55pt;height:15.1pt;rotation:180;flip:x;z-index:251659264;visibility:visible;mso-wrap-style:square;mso-width-percent:0;mso-height-percent:0;mso-wrap-distance-left:9pt;mso-wrap-distance-top:0;mso-wrap-distance-right:9pt;mso-wrap-distance-bottom:0;mso-position-horizontal:center;mso-position-horizontal-relative:right-margin-area;mso-position-vertical:center;mso-position-vertical-relative:bottom-margin-area;mso-width-percent:0;mso-height-percent:0;mso-width-relative:page;mso-height-relative:bottom-margin-area;v-text-anchor:top" o:gfxdata="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" filled="f" fillcolor="#c0504d" stroked="f" strokecolor="#5c83b4" strokeweight="2.25pt">
+                  <v:textbox inset=",0,,0">
+                    <w:txbxContent>
+                      <w:p>
+                        <w:pPr>
+                          <w:pBdr>
+                            <w:top w:val="single" w:sz="4" w:space="1" w:color="7F7F7F" w:themeColor="background1" w:themeShade="7F"/>
+                          </w:pBdr>
+                          <w:jc w:val="center"/>
+                          <w:rPr>
+                            <w:color w:val="ED7D31" w:themeColor="accent2"/>
+                          </w:rPr>
+                        </w:pPr>
+                        <w:r>
+                          <w:fldChar w:fldCharType="begin"/>
+                        </w:r>
+                        <w:r>
+                          <w:instrText>PAGE   \* MERGEFORMAT</w:instrText>
+                        </w:r>
+                        <w:r>
+                          <w:fldChar w:fldCharType="separate"/>
+                        </w:r>
+                        <w:r>
+                          <w:rPr>
+                            <w:color w:val="ED7D31" w:themeColor="accent2"/>
+                          </w:rPr>
+                          <w:t>2</w:t>
+                        </w:r>
+                        <w:r>
+                          <w:rPr>
+                            <w:color w:val="ED7D31" w:themeColor="accent2"/>
+                          </w:rPr>
+                          <w:fldChar w:fldCharType="end"/>
+                        </w:r>
+                      </w:p>
+                    </w:txbxContent>
+                  </v:textbox>
+                  <w10:wrap anchorx="margin" anchory="margin"/>
+                </v:rect>
+              </w:pict>
+            </mc:Fallback>
+          </mc:AlternateContent>
+        </w:r>
+      </w:p>
+    </w:sdtContent>
+  </w:sdt>
+</w:ftr>
+</file>
+
+<file path=word/footnotes.xml><?xml version="1.0" encoding="utf-8"?>
+<w:footnotes xmlns:wpc="http://schemas.microsoft.com/office/word/2010/wordprocessingCanvas" xmlns:cx="http://schemas.microsoft.com/office/drawing/2014/chartex" xmlns:cx1="http://schemas.microsoft.com/office/drawing/2015/9/8/chartex" xmlns:cx2="http://schemas.microsoft.com/office/drawing/2015/10/21/chartex" xmlns:cx3="http://schemas.microsoft.com/office/drawing/2016/5/9/chartex" xmlns:cx4="http://schemas.microsoft.com/office/drawing/2016/5/10/chartex" xmlns:cx5="http://schemas.microsoft.com/office/drawing/2016/5/11/chartex" xmlns:cx6="http://schemas.microsoft.com/office/drawing/2016/5/12/chartex" xmlns:cx7="http://schemas.microsoft.com/office/drawing/2016/5/13/chartex" xmlns:cx8="http://schemas.microsoft.com/office/drawing/2016/5/14/chartex" xmlns:mc="http://schemas.openxmlformats.org/markup-compatibility/2006" xmlns:aink="http://schemas.microsoft.com/office/drawing/2016/ink" xmlns:am3d="http://schemas.microsoft.com/office/drawing/2017/model3d" xmlns:o="urn:schemas-microsoft-com:office:office" xmlns:r="http://schemas.openxmlformats.org/officeDocument/2006/relationships" xmlns:m="http://schemas.openxmlformats.org/officeDocument/2006/math" xmlns:v="urn:schemas-microsoft-com:vml" xmlns:wp14="http://schemas.microsoft.com/office/word/2010/wordprocessingDrawing" xmlns:wp="http://schemas.openxmlformats.org/drawingml/2006/wordprocessingDrawing" xmlns:w10="urn:schemas-microsoft-com:office:word" xmlns:w="http://schemas.openxmlformats.org/wordprocessingml/2006/main" xmlns:w14="http://schemas.microsoft.com/office/word/2010/wordml" xmlns:w15="http://schemas.microsoft.com/office/word/2012/wordml" xmlns:w16cex="http://schemas.microsoft.com/office/word/2018/wordml/cex" xmlns:w16cid="http://schemas.microsoft.com/office/word/2016/wordml/cid" xmlns:w16="http://schemas.microsoft.com/office/word/2018/wordml" xmlns:w16sdtdh="http://schemas.microsoft.com/office/word/2020/wordml/sdtdatahash" xmlns:w16se="http://schemas.microsoft.com/office/word/2015/wordml/symex" xmlns:wpg="http://schemas.microsoft.com/office/word/2010/wordprocessingGroup" xmlns:wpi="http://schemas.microsoft.com/office/word/2010/wordprocessingInk" xmlns:wne="http://schemas.microsoft.com/office/word/2006/wordml" xmlns:wps="http://schemas.microsoft.com/office/word/2010/wordprocessingShape" mc:Ignorable="w14 w15 w16se w16cid w16 w16cex w16sdtdh wp14">
+  <w:footnote w:type="separator" w:id="-1">
+    <w:p>
+      <w:pPr>
+        <w:spacing w:after="0" w:line="240" w:lineRule="auto"/>
+      </w:pPr>
+      <w:r>
+        <w:separator/>
+      </w:r>
+    </w:p>
+  </w:footnote>
+  <w:footnote w:type="continuationSeparator" w:id="0">
+    <w:p>
+      <w:pPr>
+        <w:spacing w:after="0" w:line="240" w:lineRule="auto"/>
+      </w:pPr>
+      <w:r>
+        <w:continuationSeparator/>
+      </w:r>
+    </w:p>
+  </w:footnote>
+</w:footnotes>
+</file>
+
+<file path=word/numbering.xml><?xml version="1.0" encoding="utf-8"?>
+<w:numbering xmlns:wpc="http://schemas.microsoft.com/office/word/2010/wordprocessingCanvas" xmlns:cx="http://schemas.microsoft.com/office/drawing/2014/chartex" xmlns:cx1="http://schemas.microsoft.com/office/drawing/2015/9/8/chartex" xmlns:cx2="http://schemas.microsoft.com/office/drawing/2015/10/21/chartex" xmlns:cx3="http://schemas.microsoft.com/office/drawing/2016/5/9/chartex" xmlns:cx4="http://schemas.microsoft.com/office/drawing/2016/5/10/chartex" xmlns:cx5="http://schemas.microsoft.com/office/drawing/2016/5/11/chartex" xmlns:cx6="http://schemas.microsoft.com/office/drawing/2016/5/12/chartex" xmlns:cx7="http://schemas.microsoft.com/office/drawing/2016/5/13/chartex" xmlns:cx8="http://schemas.microsoft.com/office/drawing/2016/5/14/chartex" xmlns:mc="http://schemas.openxmlformats.org/markup-compatibility/2006" xmlns:aink="http://schemas.microsoft.com/office/drawing/2016/ink" xmlns:am3d="http://schemas.microsoft.com/office/drawing/2017/model3d" xmlns:o="urn:schemas-microsoft-com:office:office" xmlns:r="http://schemas.openxmlformats.org/officeDocument/2006/relationships" xmlns:m="http://schemas.openxmlformats.org/officeDocument/2006/math" xmlns:v="urn:schemas-microsoft-com:vml" xmlns:wp14="http://schemas.microsoft.com/office/word/2010/wordprocessingDrawing" xmlns:wp="http://schemas.openxmlformats.org/drawingml/2006/wordprocessingDrawing" xmlns:w10="urn:schemas-microsoft-com:office:word" xmlns:w="http://schemas.openxmlformats.org/wordprocessingml/2006/main" xmlns:w14="http://schemas.microsoft.com/office/word/2010/wordml" xmlns:w15="http://schemas.microsoft.com/office/word/2012/wordml" xmlns:w16cex="http://schemas.microsoft.com/office/word/2018/wordml/cex" xmlns:w16cid="http://schemas.microsoft.com/office/word/2016/wordml/cid" xmlns:w16="http://schemas.microsoft.com/office/word/2018/wordml" xmlns:w16sdtdh="http://schemas.microsoft.com/office/word/2020/wordml/sdtdatahash" xmlns:w16se="http://schemas.microsoft.com/office/word/2015/wordml/symex" xmlns:wpg="http://schemas.microsoft.com/office/word/2010/wordprocessingGroup" xmlns:wpi="http://schemas.microsoft.com/office/word/2010/wordprocessingInk" xmlns:wne="http://schemas.microsoft.com/office/word/2006/wordml" xmlns:wps="http://schemas.microsoft.com/office/word/2010/wordprocessingShape" mc:Ignorable="w14 w15 w16se w16cid w16 w16cex w16sdtdh wp14">
+  <w:abstractNum w:abstractNumId="0" w15:restartNumberingAfterBreak="0">
+    <w:nsid w:val="31C8002A"/>
+    <w:multiLevelType w:val="hybridMultilevel"/>
+    <w:tmpl w:val="FE106054"/>
+    <w:lvl w:ilvl="0" w:tplc="D3D05598">
+      <w:numFmt w:val="bullet"/>
+      <w:lvlText w:val="-"/>
+      <w:lvlJc w:val="left"/>
+      <w:pPr>
+        <w:ind w:left="720" w:hanging="360"/>
+      </w:pPr>
+      <w:rPr>
+        <w:rFonts w:ascii="Calibri" w:eastAsiaTheme="minorEastAsia" w:hAnsi="Calibri" w:cs="Calibri" w:hint="default"/>
+      </w:rPr>
+    </w:lvl>
+    <w:lvl w:ilvl="1" w:tplc="04130003" w:tentative="1">
+      <w:start w:val="1"/>
+      <w:numFmt w:val="bullet"/>
+      <w:lvlText w:val="o"/>
+      <w:lvlJc w:val="left"/>
+      <w:pPr>
+        <w:ind w:left="1440" w:hanging="360"/>
+      </w:pPr>
+      <w:rPr>
+        <w:rFonts w:ascii="Courier New" w:hAnsi="Courier New" w:cs="Courier New" w:hint="default"/>
+      </w:rPr>
+    </w:lvl>
+    <w:lvl w:ilvl="2" w:tplc="04130005" w:tentative="1">
+      <w:start w:val="1"/>
+      <w:numFmt w:val="bullet"/>
+      <w:lvlText w:val=""/>
+      <w:lvlJc w:val="left"/>
+      <w:pPr>
+        <w:ind w:left="2160" w:hanging="360"/>
+      </w:pPr>
+      <w:rPr>
+        <w:rFonts w:ascii="Wingdings" w:hAnsi="Wingdings" w:hint="default"/>
+      </w:rPr>
+    </w:lvl>
+    <w:lvl w:ilvl="3" w:tplc="04130001" w:tentative="1">
+      <w:start w:val="1"/>
+      <w:numFmt w:val="bullet"/>
+      <w:lvlText w:val=""/>
+      <w:lvlJc w:val="left"/>
+      <w:pPr>
+        <w:ind w:left="2880" w:hanging="360"/>
+      </w:pPr>
+      <w:rPr>
+        <w:rFonts w:ascii="Symbol" w:hAnsi="Symbol" w:hint="default"/>
+      </w:rPr>
+    </w:lvl>
+    <w:lvl w:ilvl="4" w:tplc="04130003" w:tentative="1">
+      <w:start w:val="1"/>
+      <w:numFmt w:val="bullet"/>
+      <w:lvlText w:val="o"/>
+      <w:lvlJc w:val="left"/>
+      <w:pPr>
+        <w:ind w:left="3600" w:hanging="360"/>
+      </w:pPr>
+      <w:rPr>
+        <w:rFonts w:ascii="Courier New" w:hAnsi="Courier New" w:cs="Courier New" w:hint="default"/>
+      </w:rPr>
+    </w:lvl>
+    <w:lvl w:ilvl="5" w:tplc="04130005" w:tentative="1">
+      <w:start w:val="1"/>
+      <w:numFmt w:val="bullet"/>
+      <w:lvlText w:val=""/>
+      <w:lvlJc w:val="left"/>
+      <w:pPr>
+        <w:ind w:left="4320" w:hanging="360"/>
+      </w:pPr>
+      <w:rPr>
+        <w:rFonts w:ascii="Wingdings" w:hAnsi="Wingdings" w:hint="default"/>
+      </w:rPr>
+    </w:lvl>
+    <w:lvl w:ilvl="6" w:tplc="04130001" w:tentative="1">
+      <w:start w:val="1"/>
+      <w:numFmt w:val="bullet"/>
+      <w:lvlText w:val=""/>
+      <w:lvlJc w:val="left"/>
+      <w:pPr>
+        <w:ind w:left="5040" w:hanging="360"/>
+      </w:pPr>
+      <w:rPr>
+        <w:rFonts w:ascii="Symbol" w:hAnsi="Symbol" w:hint="default"/>
+      </w:rPr>
+    </w:lvl>
+    <w:lvl w:ilvl="7" w:tplc="04130003" w:tentative="1">
+      <w:start w:val="1"/>
+      <w:numFmt w:val="bullet"/>
+      <w:lvlText w:val="o"/>
+      <w:lvlJc w:val="left"/>
+      <w:pPr>
+        <w:ind w:left="5760" w:hanging="360"/>
+      </w:pPr>
+      <w:rPr>
+        <w:rFonts w:ascii="Courier New" w:hAnsi="Courier New" w:cs="Courier New" w:hint="default"/>
+      </w:rPr>
+    </w:lvl>
+    <w:lvl w:ilvl="8" w:tplc="04130005" w:tentative="1">
+      <w:start w:val="1"/>
+      <w:numFmt w:val="bullet"/>
+      <w:lvlText w:val=""/>
+      <w:lvlJc w:val="left"/>
+      <w:pPr>
+        <w:ind w:left="6480" w:hanging="360"/>
+      </w:pPr>
+      <w:rPr>
+        <w:rFonts w:ascii="Wingdings" w:hAnsi="Wingdings" w:hint="default"/>
+      </w:rPr>
+    </w:lvl>
+  </w:abstractNum>
+  <w:num w:numId="1">
+    <w:abstractNumId w:val="0"/>
+  </w:num>
+</w:numbering>
+</file>
+
 <file path=word/styles.xml><?xml version="1.0" encoding="utf-8"?>
 <w:styles xmlns:mc="http://schemas.openxmlformats.org/markup-compatibility/2006" xmlns:r="http://schemas.openxmlformats.org/officeDocument/2006/relationships" xmlns:w="http://schemas.openxmlformats.org/wordprocessingml/2006/main" xmlns:w14="http://schemas.microsoft.com/office/word/2010/wordml" xmlns:w15="http://schemas.microsoft.com/office/word/2012/wordml" xmlns:w16cex="http://schemas.microsoft.com/office/word/2018/wordml/cex" xmlns:w16cid="http://schemas.microsoft.com/office/word/2016/wordml/cid" xmlns:w16="http://schemas.microsoft.com/office/word/2018/wordml" xmlns:w16sdtdh="http://schemas.microsoft.com/office/word/2020/wordml/sdtdatahash" xmlns:w16se="http://schemas.microsoft.com/office/word/2015/wordml/symex" mc:Ignorable="w14 w15 w16se w16cid w16 w16cex w16sdtdh">
   <w:docDefaults>
     <w:rPrDefault>
       <w:rPr>
-        <w:rFonts w:asciiTheme="minorHAnsi" w:eastAsiaTheme="minorHAnsi" w:hAnsiTheme="minorHAnsi" w:cstheme="minorBidi"/>
-        <w:sz w:val="22"/>
-        <w:szCs w:val="22"/>
+        <w:rFonts w:asciiTheme="minorHAnsi" w:eastAsiaTheme="minorEastAsia" w:hAnsiTheme="minorHAnsi" w:cstheme="minorBidi"/>
+        <w:sz w:val="21"/>
+        <w:szCs w:val="21"/>
         <w:lang w:val="nl-NL" w:eastAsia="en-US" w:bidi="ar-SA"/>
       </w:rPr>
     </w:rPrDefault>
     <w:pPrDefault>
       <w:pPr>
-        <w:spacing w:after="160" w:line="259" w:lineRule="auto"/>
+        <w:spacing w:after="160" w:line="300" w:lineRule="auto"/>
       </w:pPr>
     </w:pPrDefault>
   </w:docDefaults>
@@ -419,6 +1287,213 @@
   <w:style w:type="paragraph" w:default="1" w:styleId="Standaard">
     <w:name w:val="Normal"/>
     <w:qFormat/>
+    <w:rsid w:val="0053026F"/>
+  </w:style>
+  <w:style w:type="paragraph" w:styleId="Kop1">
+    <w:name w:val="heading 1"/>
+    <w:basedOn w:val="Standaard"/>
+    <w:next w:val="Standaard"/>
+    <w:link w:val="Kop1Char"/>
+    <w:uiPriority w:val="9"/>
+    <w:qFormat/>
+    <w:rsid w:val="0053026F"/>
+    <w:pPr>
+      <w:keepNext/>
+      <w:keepLines/>
+      <w:spacing w:before="320" w:after="80" w:line="240" w:lineRule="auto"/>
+      <w:jc w:val="center"/>
+      <w:outlineLvl w:val="0"/>
+    </w:pPr>
+    <w:rPr>
+      <w:rFonts w:asciiTheme="majorHAnsi" w:eastAsiaTheme="majorEastAsia" w:hAnsiTheme="majorHAnsi" w:cstheme="majorBidi"/>
+      <w:color w:val="2F5496" w:themeColor="accent1" w:themeShade="BF"/>
+      <w:sz w:val="40"/>
+      <w:szCs w:val="40"/>
+    </w:rPr>
+  </w:style>
+  <w:style w:type="paragraph" w:styleId="Kop2">
+    <w:name w:val="heading 2"/>
+    <w:basedOn w:val="Standaard"/>
+    <w:next w:val="Standaard"/>
+    <w:link w:val="Kop2Char"/>
+    <w:uiPriority w:val="9"/>
+    <w:semiHidden/>
+    <w:unhideWhenUsed/>
+    <w:qFormat/>
+    <w:rsid w:val="0053026F"/>
+    <w:pPr>
+      <w:keepNext/>
+      <w:keepLines/>
+      <w:spacing w:before="160" w:after="40" w:line="240" w:lineRule="auto"/>
+      <w:jc w:val="center"/>
+      <w:outlineLvl w:val="1"/>
+    </w:pPr>
+    <w:rPr>
+      <w:rFonts w:asciiTheme="majorHAnsi" w:eastAsiaTheme="majorEastAsia" w:hAnsiTheme="majorHAnsi" w:cstheme="majorBidi"/>
+      <w:sz w:val="32"/>
+      <w:szCs w:val="32"/>
+    </w:rPr>
+  </w:style>
+  <w:style w:type="paragraph" w:styleId="Kop3">
+    <w:name w:val="heading 3"/>
+    <w:basedOn w:val="Standaard"/>
+    <w:next w:val="Standaard"/>
+    <w:link w:val="Kop3Char"/>
+    <w:uiPriority w:val="9"/>
+    <w:semiHidden/>
+    <w:unhideWhenUsed/>
+    <w:qFormat/>
+    <w:rsid w:val="0053026F"/>
+    <w:pPr>
+      <w:keepNext/>
+      <w:keepLines/>
+      <w:spacing w:before="160" w:after="0" w:line="240" w:lineRule="auto"/>
+      <w:outlineLvl w:val="2"/>
+    </w:pPr>
+    <w:rPr>
+      <w:rFonts w:asciiTheme="majorHAnsi" w:eastAsiaTheme="majorEastAsia" w:hAnsiTheme="majorHAnsi" w:cstheme="majorBidi"/>
+      <w:sz w:val="32"/>
+      <w:szCs w:val="32"/>
+    </w:rPr>
+  </w:style>
+  <w:style w:type="paragraph" w:styleId="Kop4">
+    <w:name w:val="heading 4"/>
+    <w:basedOn w:val="Standaard"/>
+    <w:next w:val="Standaard"/>
+    <w:link w:val="Kop4Char"/>
+    <w:uiPriority w:val="9"/>
+    <w:semiHidden/>
+    <w:unhideWhenUsed/>
+    <w:qFormat/>
+    <w:rsid w:val="0053026F"/>
+    <w:pPr>
+      <w:keepNext/>
+      <w:keepLines/>
+      <w:spacing w:before="80" w:after="0"/>
+      <w:outlineLvl w:val="3"/>
+    </w:pPr>
+    <w:rPr>
+      <w:rFonts w:asciiTheme="majorHAnsi" w:eastAsiaTheme="majorEastAsia" w:hAnsiTheme="majorHAnsi" w:cstheme="majorBidi"/>
+      <w:i/>
+      <w:iCs/>
+      <w:sz w:val="30"/>
+      <w:szCs w:val="30"/>
+    </w:rPr>
+  </w:style>
+  <w:style w:type="paragraph" w:styleId="Kop5">
+    <w:name w:val="heading 5"/>
+    <w:basedOn w:val="Standaard"/>
+    <w:next w:val="Standaard"/>
+    <w:link w:val="Kop5Char"/>
+    <w:uiPriority w:val="9"/>
+    <w:semiHidden/>
+    <w:unhideWhenUsed/>
+    <w:qFormat/>
+    <w:rsid w:val="0053026F"/>
+    <w:pPr>
+      <w:keepNext/>
+      <w:keepLines/>
+      <w:spacing w:before="40" w:after="0"/>
+      <w:outlineLvl w:val="4"/>
+    </w:pPr>
+    <w:rPr>
+      <w:rFonts w:asciiTheme="majorHAnsi" w:eastAsiaTheme="majorEastAsia" w:hAnsiTheme="majorHAnsi" w:cstheme="majorBidi"/>
+      <w:sz w:val="28"/>
+      <w:szCs w:val="28"/>
+    </w:rPr>
+  </w:style>
+  <w:style w:type="paragraph" w:styleId="Kop6">
+    <w:name w:val="heading 6"/>
+    <w:basedOn w:val="Standaard"/>
+    <w:next w:val="Standaard"/>
+    <w:link w:val="Kop6Char"/>
+    <w:uiPriority w:val="9"/>
+    <w:semiHidden/>
+    <w:unhideWhenUsed/>
+    <w:qFormat/>
+    <w:rsid w:val="0053026F"/>
+    <w:pPr>
+      <w:keepNext/>
+      <w:keepLines/>
+      <w:spacing w:before="40" w:after="0"/>
+      <w:outlineLvl w:val="5"/>
+    </w:pPr>
+    <w:rPr>
+      <w:rFonts w:asciiTheme="majorHAnsi" w:eastAsiaTheme="majorEastAsia" w:hAnsiTheme="majorHAnsi" w:cstheme="majorBidi"/>
+      <w:i/>
+      <w:iCs/>
+      <w:sz w:val="26"/>
+      <w:szCs w:val="26"/>
+    </w:rPr>
+  </w:style>
+  <w:style w:type="paragraph" w:styleId="Kop7">
+    <w:name w:val="heading 7"/>
+    <w:basedOn w:val="Standaard"/>
+    <w:next w:val="Standaard"/>
+    <w:link w:val="Kop7Char"/>
+    <w:uiPriority w:val="9"/>
+    <w:semiHidden/>
+    <w:unhideWhenUsed/>
+    <w:qFormat/>
+    <w:rsid w:val="0053026F"/>
+    <w:pPr>
+      <w:keepNext/>
+      <w:keepLines/>
+      <w:spacing w:before="40" w:after="0"/>
+      <w:outlineLvl w:val="6"/>
+    </w:pPr>
+    <w:rPr>
+      <w:rFonts w:asciiTheme="majorHAnsi" w:eastAsiaTheme="majorEastAsia" w:hAnsiTheme="majorHAnsi" w:cstheme="majorBidi"/>
+      <w:sz w:val="24"/>
+      <w:szCs w:val="24"/>
+    </w:rPr>
+  </w:style>
+  <w:style w:type="paragraph" w:styleId="Kop8">
+    <w:name w:val="heading 8"/>
+    <w:basedOn w:val="Standaard"/>
+    <w:next w:val="Standaard"/>
+    <w:link w:val="Kop8Char"/>
+    <w:uiPriority w:val="9"/>
+    <w:semiHidden/>
+    <w:unhideWhenUsed/>
+    <w:qFormat/>
+    <w:rsid w:val="0053026F"/>
+    <w:pPr>
+      <w:keepNext/>
+      <w:keepLines/>
+      <w:spacing w:before="40" w:after="0"/>
+      <w:outlineLvl w:val="7"/>
+    </w:pPr>
+    <w:rPr>
+      <w:rFonts w:asciiTheme="majorHAnsi" w:eastAsiaTheme="majorEastAsia" w:hAnsiTheme="majorHAnsi" w:cstheme="majorBidi"/>
+      <w:i/>
+      <w:iCs/>
+      <w:sz w:val="22"/>
+      <w:szCs w:val="22"/>
+    </w:rPr>
+  </w:style>
+  <w:style w:type="paragraph" w:styleId="Kop9">
+    <w:name w:val="heading 9"/>
+    <w:basedOn w:val="Standaard"/>
+    <w:next w:val="Standaard"/>
+    <w:link w:val="Kop9Char"/>
+    <w:uiPriority w:val="9"/>
+    <w:semiHidden/>
+    <w:unhideWhenUsed/>
+    <w:qFormat/>
+    <w:rsid w:val="0053026F"/>
+    <w:pPr>
+      <w:keepNext/>
+      <w:keepLines/>
+      <w:spacing w:before="40" w:after="0"/>
+      <w:outlineLvl w:val="8"/>
+    </w:pPr>
+    <w:rPr>
+      <w:b/>
+      <w:bCs/>
+      <w:i/>
+      <w:iCs/>
+    </w:rPr>
   </w:style>
   <w:style w:type="character" w:default="1" w:styleId="Standaardalinea-lettertype">
     <w:name w:val="Default Paragraph Font"/>
@@ -454,17 +1529,23 @@
     <w:link w:val="TitelChar"/>
     <w:uiPriority w:val="10"/>
     <w:qFormat/>
-    <w:rsid w:val="00166267"/>
+    <w:rsid w:val="0053026F"/>
     <w:pPr>
-      <w:spacing w:after="0" w:line="240" w:lineRule="auto"/>
+      <w:pBdr>
+        <w:top w:val="single" w:sz="6" w:space="8" w:color="A5A5A5" w:themeColor="accent3"/>
+        <w:bottom w:val="single" w:sz="6" w:space="8" w:color="A5A5A5" w:themeColor="accent3"/>
+      </w:pBdr>
+      <w:spacing w:after="400" w:line="240" w:lineRule="auto"/>
       <w:contextualSpacing/>
+      <w:jc w:val="center"/>
     </w:pPr>
     <w:rPr>
       <w:rFonts w:asciiTheme="majorHAnsi" w:eastAsiaTheme="majorEastAsia" w:hAnsiTheme="majorHAnsi" w:cstheme="majorBidi"/>
-      <w:spacing w:val="-10"/>
-      <w:kern w:val="28"/>
-      <w:sz w:val="56"/>
-      <w:szCs w:val="56"/>
+      <w:caps/>
+      <w:color w:val="44546A" w:themeColor="text2"/>
+      <w:spacing w:val="30"/>
+      <w:sz w:val="72"/>
+      <w:szCs w:val="72"/>
     </w:rPr>
   </w:style>
   <w:style w:type="character" w:customStyle="1" w:styleId="TitelChar">
@@ -472,14 +1553,453 @@
     <w:basedOn w:val="Standaardalinea-lettertype"/>
     <w:link w:val="Titel"/>
     <w:uiPriority w:val="10"/>
-    <w:rsid w:val="00166267"/>
+    <w:rsid w:val="0053026F"/>
     <w:rPr>
       <w:rFonts w:asciiTheme="majorHAnsi" w:eastAsiaTheme="majorEastAsia" w:hAnsiTheme="majorHAnsi" w:cstheme="majorBidi"/>
-      <w:spacing w:val="-10"/>
-      <w:kern w:val="28"/>
-      <w:sz w:val="56"/>
-      <w:szCs w:val="56"/>
-    </w:rPr>
+      <w:caps/>
+      <w:color w:val="44546A" w:themeColor="text2"/>
+      <w:spacing w:val="30"/>
+      <w:sz w:val="72"/>
+      <w:szCs w:val="72"/>
+    </w:rPr>
+  </w:style>
+  <w:style w:type="paragraph" w:styleId="Ondertitel">
+    <w:name w:val="Subtitle"/>
+    <w:basedOn w:val="Standaard"/>
+    <w:next w:val="Standaard"/>
+    <w:link w:val="OndertitelChar"/>
+    <w:uiPriority w:val="11"/>
+    <w:qFormat/>
+    <w:rsid w:val="0053026F"/>
+    <w:pPr>
+      <w:numPr>
+        <w:ilvl w:val="1"/>
+      </w:numPr>
+      <w:jc w:val="center"/>
+    </w:pPr>
+    <w:rPr>
+      <w:color w:val="44546A" w:themeColor="text2"/>
+      <w:sz w:val="28"/>
+      <w:szCs w:val="28"/>
+    </w:rPr>
+  </w:style>
+  <w:style w:type="character" w:customStyle="1" w:styleId="OndertitelChar">
+    <w:name w:val="Ondertitel Char"/>
+    <w:basedOn w:val="Standaardalinea-lettertype"/>
+    <w:link w:val="Ondertitel"/>
+    <w:uiPriority w:val="11"/>
+    <w:rsid w:val="0053026F"/>
+    <w:rPr>
+      <w:color w:val="44546A" w:themeColor="text2"/>
+      <w:sz w:val="28"/>
+      <w:szCs w:val="28"/>
+    </w:rPr>
+  </w:style>
+  <w:style w:type="character" w:customStyle="1" w:styleId="Kop1Char">
+    <w:name w:val="Kop 1 Char"/>
+    <w:basedOn w:val="Standaardalinea-lettertype"/>
+    <w:link w:val="Kop1"/>
+    <w:uiPriority w:val="9"/>
+    <w:rsid w:val="0053026F"/>
+    <w:rPr>
+      <w:rFonts w:asciiTheme="majorHAnsi" w:eastAsiaTheme="majorEastAsia" w:hAnsiTheme="majorHAnsi" w:cstheme="majorBidi"/>
+      <w:color w:val="2F5496" w:themeColor="accent1" w:themeShade="BF"/>
+      <w:sz w:val="40"/>
+      <w:szCs w:val="40"/>
+    </w:rPr>
+  </w:style>
+  <w:style w:type="character" w:customStyle="1" w:styleId="Kop2Char">
+    <w:name w:val="Kop 2 Char"/>
+    <w:basedOn w:val="Standaardalinea-lettertype"/>
+    <w:link w:val="Kop2"/>
+    <w:uiPriority w:val="9"/>
+    <w:semiHidden/>
+    <w:rsid w:val="0053026F"/>
+    <w:rPr>
+      <w:rFonts w:asciiTheme="majorHAnsi" w:eastAsiaTheme="majorEastAsia" w:hAnsiTheme="majorHAnsi" w:cstheme="majorBidi"/>
+      <w:sz w:val="32"/>
+      <w:szCs w:val="32"/>
+    </w:rPr>
+  </w:style>
+  <w:style w:type="character" w:customStyle="1" w:styleId="Kop3Char">
+    <w:name w:val="Kop 3 Char"/>
+    <w:basedOn w:val="Standaardalinea-lettertype"/>
+    <w:link w:val="Kop3"/>
+    <w:uiPriority w:val="9"/>
+    <w:semiHidden/>
+    <w:rsid w:val="0053026F"/>
+    <w:rPr>
+      <w:rFonts w:asciiTheme="majorHAnsi" w:eastAsiaTheme="majorEastAsia" w:hAnsiTheme="majorHAnsi" w:cstheme="majorBidi"/>
+      <w:sz w:val="32"/>
+      <w:szCs w:val="32"/>
+    </w:rPr>
+  </w:style>
+  <w:style w:type="character" w:customStyle="1" w:styleId="Kop4Char">
+    <w:name w:val="Kop 4 Char"/>
+    <w:basedOn w:val="Standaardalinea-lettertype"/>
+    <w:link w:val="Kop4"/>
+    <w:uiPriority w:val="9"/>
+    <w:semiHidden/>
+    <w:rsid w:val="0053026F"/>
+    <w:rPr>
+      <w:rFonts w:asciiTheme="majorHAnsi" w:eastAsiaTheme="majorEastAsia" w:hAnsiTheme="majorHAnsi" w:cstheme="majorBidi"/>
+      <w:i/>
+      <w:iCs/>
+      <w:sz w:val="30"/>
+      <w:szCs w:val="30"/>
+    </w:rPr>
+  </w:style>
+  <w:style w:type="character" w:customStyle="1" w:styleId="Kop5Char">
+    <w:name w:val="Kop 5 Char"/>
+    <w:basedOn w:val="Standaardalinea-lettertype"/>
+    <w:link w:val="Kop5"/>
+    <w:uiPriority w:val="9"/>
+    <w:semiHidden/>
+    <w:rsid w:val="0053026F"/>
+    <w:rPr>
+      <w:rFonts w:asciiTheme="majorHAnsi" w:eastAsiaTheme="majorEastAsia" w:hAnsiTheme="majorHAnsi" w:cstheme="majorBidi"/>
+      <w:sz w:val="28"/>
+      <w:szCs w:val="28"/>
+    </w:rPr>
+  </w:style>
+  <w:style w:type="character" w:customStyle="1" w:styleId="Kop6Char">
+    <w:name w:val="Kop 6 Char"/>
+    <w:basedOn w:val="Standaardalinea-lettertype"/>
+    <w:link w:val="Kop6"/>
+    <w:uiPriority w:val="9"/>
+    <w:semiHidden/>
+    <w:rsid w:val="0053026F"/>
+    <w:rPr>
+      <w:rFonts w:asciiTheme="majorHAnsi" w:eastAsiaTheme="majorEastAsia" w:hAnsiTheme="majorHAnsi" w:cstheme="majorBidi"/>
+      <w:i/>
+      <w:iCs/>
+      <w:sz w:val="26"/>
+      <w:szCs w:val="26"/>
+    </w:rPr>
+  </w:style>
+  <w:style w:type="character" w:customStyle="1" w:styleId="Kop7Char">
+    <w:name w:val="Kop 7 Char"/>
+    <w:basedOn w:val="Standaardalinea-lettertype"/>
+    <w:link w:val="Kop7"/>
+    <w:uiPriority w:val="9"/>
+    <w:semiHidden/>
+    <w:rsid w:val="0053026F"/>
+    <w:rPr>
+      <w:rFonts w:asciiTheme="majorHAnsi" w:eastAsiaTheme="majorEastAsia" w:hAnsiTheme="majorHAnsi" w:cstheme="majorBidi"/>
+      <w:sz w:val="24"/>
+      <w:szCs w:val="24"/>
+    </w:rPr>
+  </w:style>
+  <w:style w:type="character" w:customStyle="1" w:styleId="Kop8Char">
+    <w:name w:val="Kop 8 Char"/>
+    <w:basedOn w:val="Standaardalinea-lettertype"/>
+    <w:link w:val="Kop8"/>
+    <w:uiPriority w:val="9"/>
+    <w:semiHidden/>
+    <w:rsid w:val="0053026F"/>
+    <w:rPr>
+      <w:rFonts w:asciiTheme="majorHAnsi" w:eastAsiaTheme="majorEastAsia" w:hAnsiTheme="majorHAnsi" w:cstheme="majorBidi"/>
+      <w:i/>
+      <w:iCs/>
+      <w:sz w:val="22"/>
+      <w:szCs w:val="22"/>
+    </w:rPr>
+  </w:style>
+  <w:style w:type="character" w:customStyle="1" w:styleId="Kop9Char">
+    <w:name w:val="Kop 9 Char"/>
+    <w:basedOn w:val="Standaardalinea-lettertype"/>
+    <w:link w:val="Kop9"/>
+    <w:uiPriority w:val="9"/>
+    <w:semiHidden/>
+    <w:rsid w:val="0053026F"/>
+    <w:rPr>
+      <w:b/>
+      <w:bCs/>
+      <w:i/>
+      <w:iCs/>
+    </w:rPr>
+  </w:style>
+  <w:style w:type="paragraph" w:styleId="Bijschrift">
+    <w:name w:val="caption"/>
+    <w:basedOn w:val="Standaard"/>
+    <w:next w:val="Standaard"/>
+    <w:uiPriority w:val="35"/>
+    <w:semiHidden/>
+    <w:unhideWhenUsed/>
+    <w:qFormat/>
+    <w:rsid w:val="0053026F"/>
+    <w:pPr>
+      <w:spacing w:line="240" w:lineRule="auto"/>
+    </w:pPr>
+    <w:rPr>
+      <w:b/>
+      <w:bCs/>
+      <w:color w:val="404040" w:themeColor="text1" w:themeTint="BF"/>
+      <w:sz w:val="16"/>
+      <w:szCs w:val="16"/>
+    </w:rPr>
+  </w:style>
+  <w:style w:type="character" w:styleId="Zwaar">
+    <w:name w:val="Strong"/>
+    <w:basedOn w:val="Standaardalinea-lettertype"/>
+    <w:uiPriority w:val="22"/>
+    <w:qFormat/>
+    <w:rsid w:val="0053026F"/>
+    <w:rPr>
+      <w:b/>
+      <w:bCs/>
+    </w:rPr>
+  </w:style>
+  <w:style w:type="character" w:styleId="Nadruk">
+    <w:name w:val="Emphasis"/>
+    <w:basedOn w:val="Standaardalinea-lettertype"/>
+    <w:uiPriority w:val="20"/>
+    <w:qFormat/>
+    <w:rsid w:val="0053026F"/>
+    <w:rPr>
+      <w:i/>
+      <w:iCs/>
+      <w:color w:val="000000" w:themeColor="text1"/>
+    </w:rPr>
+  </w:style>
+  <w:style w:type="paragraph" w:styleId="Geenafstand">
+    <w:name w:val="No Spacing"/>
+    <w:uiPriority w:val="1"/>
+    <w:qFormat/>
+    <w:rsid w:val="0053026F"/>
+    <w:pPr>
+      <w:spacing w:after="0" w:line="240" w:lineRule="auto"/>
+    </w:pPr>
+  </w:style>
+  <w:style w:type="paragraph" w:styleId="Citaat">
+    <w:name w:val="Quote"/>
+    <w:basedOn w:val="Standaard"/>
+    <w:next w:val="Standaard"/>
+    <w:link w:val="CitaatChar"/>
+    <w:uiPriority w:val="29"/>
+    <w:qFormat/>
+    <w:rsid w:val="0053026F"/>
+    <w:pPr>
+      <w:spacing w:before="160"/>
+      <w:ind w:left="720" w:right="720"/>
+      <w:jc w:val="center"/>
+    </w:pPr>
+    <w:rPr>
+      <w:i/>
+      <w:iCs/>
+      <w:color w:val="7B7B7B" w:themeColor="accent3" w:themeShade="BF"/>
+      <w:sz w:val="24"/>
+      <w:szCs w:val="24"/>
+    </w:rPr>
+  </w:style>
+  <w:style w:type="character" w:customStyle="1" w:styleId="CitaatChar">
+    <w:name w:val="Citaat Char"/>
+    <w:basedOn w:val="Standaardalinea-lettertype"/>
+    <w:link w:val="Citaat"/>
+    <w:uiPriority w:val="29"/>
+    <w:rsid w:val="0053026F"/>
+    <w:rPr>
+      <w:i/>
+      <w:iCs/>
+      <w:color w:val="7B7B7B" w:themeColor="accent3" w:themeShade="BF"/>
+      <w:sz w:val="24"/>
+      <w:szCs w:val="24"/>
+    </w:rPr>
+  </w:style>
+  <w:style w:type="paragraph" w:styleId="Duidelijkcitaat">
+    <w:name w:val="Intense Quote"/>
+    <w:basedOn w:val="Standaard"/>
+    <w:next w:val="Standaard"/>
+    <w:link w:val="DuidelijkcitaatChar"/>
+    <w:uiPriority w:val="30"/>
+    <w:qFormat/>
+    <w:rsid w:val="0053026F"/>
+    <w:pPr>
+      <w:spacing w:before="160" w:line="276" w:lineRule="auto"/>
+      <w:ind w:left="936" w:right="936"/>
+      <w:jc w:val="center"/>
+    </w:pPr>
+    <w:rPr>
+      <w:rFonts w:asciiTheme="majorHAnsi" w:eastAsiaTheme="majorEastAsia" w:hAnsiTheme="majorHAnsi" w:cstheme="majorBidi"/>
+      <w:caps/>
+      <w:color w:val="2F5496" w:themeColor="accent1" w:themeShade="BF"/>
+      <w:sz w:val="28"/>
+      <w:szCs w:val="28"/>
+    </w:rPr>
+  </w:style>
+  <w:style w:type="character" w:customStyle="1" w:styleId="DuidelijkcitaatChar">
+    <w:name w:val="Duidelijk citaat Char"/>
+    <w:basedOn w:val="Standaardalinea-lettertype"/>
+    <w:link w:val="Duidelijkcitaat"/>
+    <w:uiPriority w:val="30"/>
+    <w:rsid w:val="0053026F"/>
+    <w:rPr>
+      <w:rFonts w:asciiTheme="majorHAnsi" w:eastAsiaTheme="majorEastAsia" w:hAnsiTheme="majorHAnsi" w:cstheme="majorBidi"/>
+      <w:caps/>
+      <w:color w:val="2F5496" w:themeColor="accent1" w:themeShade="BF"/>
+      <w:sz w:val="28"/>
+      <w:szCs w:val="28"/>
+    </w:rPr>
+  </w:style>
+  <w:style w:type="character" w:styleId="Subtielebenadrukking">
+    <w:name w:val="Subtle Emphasis"/>
+    <w:basedOn w:val="Standaardalinea-lettertype"/>
+    <w:uiPriority w:val="19"/>
+    <w:qFormat/>
+    <w:rsid w:val="0053026F"/>
+    <w:rPr>
+      <w:i/>
+      <w:iCs/>
+      <w:color w:val="595959" w:themeColor="text1" w:themeTint="A6"/>
+    </w:rPr>
+  </w:style>
+  <w:style w:type="character" w:styleId="Intensievebenadrukking">
+    <w:name w:val="Intense Emphasis"/>
+    <w:basedOn w:val="Standaardalinea-lettertype"/>
+    <w:uiPriority w:val="21"/>
+    <w:qFormat/>
+    <w:rsid w:val="0053026F"/>
+    <w:rPr>
+      <w:b/>
+      <w:bCs/>
+      <w:i/>
+      <w:iCs/>
+      <w:color w:val="auto"/>
+    </w:rPr>
+  </w:style>
+  <w:style w:type="character" w:styleId="Subtieleverwijzing">
+    <w:name w:val="Subtle Reference"/>
+    <w:basedOn w:val="Standaardalinea-lettertype"/>
+    <w:uiPriority w:val="31"/>
+    <w:qFormat/>
+    <w:rsid w:val="0053026F"/>
+    <w:rPr>
+      <w:caps w:val="0"/>
+      <w:smallCaps/>
+      <w:color w:val="404040" w:themeColor="text1" w:themeTint="BF"/>
+      <w:spacing w:val="0"/>
+      <w:u w:val="single" w:color="7F7F7F" w:themeColor="text1" w:themeTint="80"/>
+    </w:rPr>
+  </w:style>
+  <w:style w:type="character" w:styleId="Intensieveverwijzing">
+    <w:name w:val="Intense Reference"/>
+    <w:basedOn w:val="Standaardalinea-lettertype"/>
+    <w:uiPriority w:val="32"/>
+    <w:qFormat/>
+    <w:rsid w:val="0053026F"/>
+    <w:rPr>
+      <w:b/>
+      <w:bCs/>
+      <w:caps w:val="0"/>
+      <w:smallCaps/>
+      <w:color w:val="auto"/>
+      <w:spacing w:val="0"/>
+      <w:u w:val="single"/>
+    </w:rPr>
+  </w:style>
+  <w:style w:type="character" w:styleId="Titelvanboek">
+    <w:name w:val="Book Title"/>
+    <w:basedOn w:val="Standaardalinea-lettertype"/>
+    <w:uiPriority w:val="33"/>
+    <w:qFormat/>
+    <w:rsid w:val="0053026F"/>
+    <w:rPr>
+      <w:b/>
+      <w:bCs/>
+      <w:caps w:val="0"/>
+      <w:smallCaps/>
+      <w:spacing w:val="0"/>
+    </w:rPr>
+  </w:style>
+  <w:style w:type="paragraph" w:styleId="Kopvaninhoudsopgave">
+    <w:name w:val="TOC Heading"/>
+    <w:basedOn w:val="Kop1"/>
+    <w:next w:val="Standaard"/>
+    <w:uiPriority w:val="39"/>
+    <w:unhideWhenUsed/>
+    <w:qFormat/>
+    <w:rsid w:val="0053026F"/>
+    <w:pPr>
+      <w:outlineLvl w:val="9"/>
+    </w:pPr>
+  </w:style>
+  <w:style w:type="paragraph" w:styleId="Inhopg1">
+    <w:name w:val="toc 1"/>
+    <w:basedOn w:val="Standaard"/>
+    <w:next w:val="Standaard"/>
+    <w:autoRedefine/>
+    <w:uiPriority w:val="39"/>
+    <w:unhideWhenUsed/>
+    <w:rsid w:val="005365E9"/>
+    <w:pPr>
+      <w:spacing w:after="100"/>
+    </w:pPr>
+  </w:style>
+  <w:style w:type="character" w:styleId="Hyperlink">
+    <w:name w:val="Hyperlink"/>
+    <w:basedOn w:val="Standaardalinea-lettertype"/>
+    <w:uiPriority w:val="99"/>
+    <w:unhideWhenUsed/>
+    <w:rsid w:val="005365E9"/>
+    <w:rPr>
+      <w:color w:val="0563C1" w:themeColor="hyperlink"/>
+      <w:u w:val="single"/>
+    </w:rPr>
+  </w:style>
+  <w:style w:type="paragraph" w:styleId="Koptekst">
+    <w:name w:val="header"/>
+    <w:basedOn w:val="Standaard"/>
+    <w:link w:val="KoptekstChar"/>
+    <w:uiPriority w:val="99"/>
+    <w:unhideWhenUsed/>
+    <w:rsid w:val="005365E9"/>
+    <w:pPr>
+      <w:tabs>
+        <w:tab w:val="center" w:pos="4536"/>
+        <w:tab w:val="right" w:pos="9072"/>
+      </w:tabs>
+      <w:spacing w:after="0" w:line="240" w:lineRule="auto"/>
+    </w:pPr>
+  </w:style>
+  <w:style w:type="character" w:customStyle="1" w:styleId="KoptekstChar">
+    <w:name w:val="Koptekst Char"/>
+    <w:basedOn w:val="Standaardalinea-lettertype"/>
+    <w:link w:val="Koptekst"/>
+    <w:uiPriority w:val="99"/>
+    <w:rsid w:val="005365E9"/>
+  </w:style>
+  <w:style w:type="paragraph" w:styleId="Voettekst">
+    <w:name w:val="footer"/>
+    <w:basedOn w:val="Standaard"/>
+    <w:link w:val="VoettekstChar"/>
+    <w:uiPriority w:val="99"/>
+    <w:unhideWhenUsed/>
+    <w:rsid w:val="005365E9"/>
+    <w:pPr>
+      <w:tabs>
+        <w:tab w:val="center" w:pos="4536"/>
+        <w:tab w:val="right" w:pos="9072"/>
+      </w:tabs>
+      <w:spacing w:after="0" w:line="240" w:lineRule="auto"/>
+    </w:pPr>
+  </w:style>
+  <w:style w:type="character" w:customStyle="1" w:styleId="VoettekstChar">
+    <w:name w:val="Voettekst Char"/>
+    <w:basedOn w:val="Standaardalinea-lettertype"/>
+    <w:link w:val="Voettekst"/>
+    <w:uiPriority w:val="99"/>
+    <w:rsid w:val="005365E9"/>
+  </w:style>
+  <w:style w:type="paragraph" w:styleId="Lijstalinea">
+    <w:name w:val="List Paragraph"/>
+    <w:basedOn w:val="Standaard"/>
+    <w:uiPriority w:val="34"/>
+    <w:qFormat/>
+    <w:rsid w:val="00B61CC7"/>
+    <w:pPr>
+      <w:ind w:left="720"/>
+      <w:contextualSpacing/>
+    </w:pPr>
   </w:style>
 </w:styles>
 </file>

</xml_diff>

<commit_message>
modified:   Documentatie website informatica.docx 	new file:   VIDEO-2026-06-07-21-28-05.mp4 	modified:   script.js
</commit_message>
<xml_diff>
--- a/Documentatie website informatica.docx
+++ b/Documentatie website informatica.docx
@@ -148,6 +148,12 @@
     </w:p>
     <w:sdt>
       <w:sdtPr>
+        <w:rPr>
+          <w:rFonts w:asciiTheme="minorHAnsi" w:eastAsiaTheme="minorEastAsia" w:hAnsiTheme="minorHAnsi" w:cstheme="minorBidi"/>
+          <w:color w:val="auto"/>
+          <w:sz w:val="21"/>
+          <w:szCs w:val="21"/>
+        </w:rPr>
         <w:id w:val="564065681"/>
         <w:docPartObj>
           <w:docPartGallery w:val="Table of Contents"/>
@@ -156,12 +162,8 @@
       </w:sdtPr>
       <w:sdtEndPr>
         <w:rPr>
-          <w:rFonts w:asciiTheme="minorHAnsi" w:eastAsiaTheme="minorEastAsia" w:hAnsiTheme="minorHAnsi" w:cstheme="minorBidi"/>
           <w:b/>
           <w:bCs/>
-          <w:color w:val="auto"/>
-          <w:sz w:val="21"/>
-          <w:szCs w:val="21"/>
         </w:rPr>
       </w:sdtEndPr>
       <w:sdtContent>
@@ -181,6 +183,9 @@
             </w:tabs>
             <w:rPr>
               <w:noProof/>
+              <w:sz w:val="22"/>
+              <w:szCs w:val="22"/>
+              <w:lang w:eastAsia="nl-NL"/>
             </w:rPr>
           </w:pPr>
           <w:r>
@@ -192,7 +197,7 @@
           <w:r>
             <w:fldChar w:fldCharType="separate"/>
           </w:r>
-          <w:hyperlink w:anchor="_Toc231681858" w:history="1">
+          <w:hyperlink w:anchor="_Toc231684465" w:history="1">
             <w:r>
               <w:rPr>
                 <w:rStyle w:val="Hyperlink"/>
@@ -219,7 +224,7 @@
                 <w:noProof/>
                 <w:webHidden/>
               </w:rPr>
-              <w:instrText xml:space="preserve"> PAGEREF _Toc231681858 \h </w:instrText>
+              <w:instrText xml:space="preserve"> PAGEREF _Toc231684465 \h </w:instrText>
             </w:r>
             <w:r>
               <w:rPr>
@@ -251,6 +256,148 @@
           </w:hyperlink>
         </w:p>
         <w:p>
+          <w:pPr>
+            <w:pStyle w:val="Inhopg1"/>
+            <w:tabs>
+              <w:tab w:val="right" w:leader="dot" w:pos="9062"/>
+            </w:tabs>
+            <w:rPr>
+              <w:noProof/>
+              <w:sz w:val="22"/>
+              <w:szCs w:val="22"/>
+              <w:lang w:eastAsia="nl-NL"/>
+            </w:rPr>
+          </w:pPr>
+          <w:hyperlink w:anchor="_Toc231684466" w:history="1">
+            <w:r>
+              <w:rPr>
+                <w:rStyle w:val="Hyperlink"/>
+                <w:noProof/>
+              </w:rPr>
+              <w:t>Opbouw</w:t>
+            </w:r>
+            <w:r>
+              <w:rPr>
+                <w:noProof/>
+                <w:webHidden/>
+              </w:rPr>
+              <w:tab/>
+            </w:r>
+            <w:r>
+              <w:rPr>
+                <w:noProof/>
+                <w:webHidden/>
+              </w:rPr>
+              <w:fldChar w:fldCharType="begin"/>
+            </w:r>
+            <w:r>
+              <w:rPr>
+                <w:noProof/>
+                <w:webHidden/>
+              </w:rPr>
+              <w:instrText xml:space="preserve"> PAGEREF _Toc231684466 \h </w:instrText>
+            </w:r>
+            <w:r>
+              <w:rPr>
+                <w:noProof/>
+                <w:webHidden/>
+              </w:rPr>
+            </w:r>
+            <w:r>
+              <w:rPr>
+                <w:noProof/>
+                <w:webHidden/>
+              </w:rPr>
+              <w:fldChar w:fldCharType="separate"/>
+            </w:r>
+            <w:r>
+              <w:rPr>
+                <w:noProof/>
+                <w:webHidden/>
+              </w:rPr>
+              <w:t>4</w:t>
+            </w:r>
+            <w:r>
+              <w:rPr>
+                <w:noProof/>
+                <w:webHidden/>
+              </w:rPr>
+              <w:fldChar w:fldCharType="end"/>
+            </w:r>
+          </w:hyperlink>
+        </w:p>
+        <w:p>
+          <w:pPr>
+            <w:pStyle w:val="Inhopg1"/>
+            <w:tabs>
+              <w:tab w:val="right" w:leader="dot" w:pos="9062"/>
+            </w:tabs>
+            <w:rPr>
+              <w:noProof/>
+              <w:sz w:val="22"/>
+              <w:szCs w:val="22"/>
+              <w:lang w:eastAsia="nl-NL"/>
+            </w:rPr>
+          </w:pPr>
+          <w:hyperlink w:anchor="_Toc231684467" w:history="1">
+            <w:r>
+              <w:rPr>
+                <w:rStyle w:val="Hyperlink"/>
+                <w:noProof/>
+              </w:rPr>
+              <w:t>Hulpmiddelen</w:t>
+            </w:r>
+            <w:r>
+              <w:rPr>
+                <w:noProof/>
+                <w:webHidden/>
+              </w:rPr>
+              <w:tab/>
+            </w:r>
+            <w:r>
+              <w:rPr>
+                <w:noProof/>
+                <w:webHidden/>
+              </w:rPr>
+              <w:fldChar w:fldCharType="begin"/>
+            </w:r>
+            <w:r>
+              <w:rPr>
+                <w:noProof/>
+                <w:webHidden/>
+              </w:rPr>
+              <w:instrText xml:space="preserve"> PAGEREF _Toc231684467 \h </w:instrText>
+            </w:r>
+            <w:r>
+              <w:rPr>
+                <w:noProof/>
+                <w:webHidden/>
+              </w:rPr>
+            </w:r>
+            <w:r>
+              <w:rPr>
+                <w:noProof/>
+                <w:webHidden/>
+              </w:rPr>
+              <w:fldChar w:fldCharType="separate"/>
+            </w:r>
+            <w:r>
+              <w:rPr>
+                <w:noProof/>
+                <w:webHidden/>
+              </w:rPr>
+              <w:t>5</w:t>
+            </w:r>
+            <w:r>
+              <w:rPr>
+                <w:noProof/>
+                <w:webHidden/>
+              </w:rPr>
+              <w:fldChar w:fldCharType="end"/>
+            </w:r>
+          </w:hyperlink>
+        </w:p>
+        <w:p>
           <w:r>
             <w:rPr>
               <w:b/>
@@ -278,7 +425,7 @@
       <w:pPr>
         <w:pStyle w:val="Kop1"/>
       </w:pPr>
-      <w:bookmarkStart w:id="0" w:name="_Toc231681858"/>
+      <w:bookmarkStart w:id="0" w:name="_Toc231684465"/>
       <w:r>
         <w:lastRenderedPageBreak/>
         <w:t>Inleiding</w:t>
@@ -310,10 +457,12 @@
       <w:pPr>
         <w:pStyle w:val="Kop1"/>
       </w:pPr>
+      <w:bookmarkStart w:id="1" w:name="_Toc231684466"/>
       <w:r>
         <w:lastRenderedPageBreak/>
         <w:t>Opbouw</w:t>
       </w:r>
+      <w:bookmarkEnd w:id="1"/>
     </w:p>
     <w:p>
       <w:r>
@@ -367,7 +516,22 @@
         <w:t>De styling heb ik daarvoor ook weer met CSS gedaan en</w:t>
       </w:r>
       <w:r>
-        <w:t xml:space="preserve"> ik heb zelfs een beetje javascript in de HTML van nieuws gezet, omdat dat makkelijker was. Ook hier heb ik weer een </w:t>
+        <w:t xml:space="preserve"> ik heb zelfs een beetje javascript in de HTML van nieuws</w:t>
+      </w:r>
+      <w:r>
+        <w:t>.html</w:t>
+      </w:r>
+      <w:r>
+        <w:t xml:space="preserve"> gezet</w:t>
+      </w:r>
+      <w:r>
+        <w:t xml:space="preserve">, voor overzicht en </w:t>
+      </w:r>
+      <w:r>
+        <w:t>gemak</w:t>
+      </w:r>
+      <w:r>
+        <w:t xml:space="preserve">. Ook hier heb ik weer een </w:t>
       </w:r>
       <w:proofErr w:type="spellStart"/>
       <w:r>
@@ -381,104 +545,163 @@
         <w:t xml:space="preserve"> het ‘nieuws artikel’ opent.</w:t>
       </w:r>
       <w:r>
-        <w:t xml:space="preserve"> Deze pagina vond ik het leukst om te</w:t>
+        <w:t xml:space="preserve"> Deze </w:t>
+      </w:r>
+      <w:r>
+        <w:t xml:space="preserve">‘nieuws’ </w:t>
+      </w:r>
+      <w:r>
+        <w:t>pagina vond ik het leukst om te</w:t>
       </w:r>
       <w:r>
         <w:t xml:space="preserve"> </w:t>
       </w:r>
       <w:r>
-        <w:t xml:space="preserve">maken, omdat hier veel javascript en styling bij kwam kijken. </w:t>
-      </w:r>
-      <w:r>
-        <w:t xml:space="preserve">Bij luisteren heb ik van </w:t>
-      </w:r>
-      <w:proofErr w:type="spellStart"/>
-      <w:r>
-        <w:t>S</w:t>
-      </w:r>
-      <w:r>
-        <w:t>potify</w:t>
-      </w:r>
-      <w:proofErr w:type="spellEnd"/>
-      <w:r>
-        <w:t xml:space="preserve"> code gebruikt en aangepast om de </w:t>
-      </w:r>
-      <w:proofErr w:type="spellStart"/>
-      <w:r>
-        <w:t>iframes</w:t>
-      </w:r>
-      <w:proofErr w:type="spellEnd"/>
-      <w:r>
-        <w:t xml:space="preserve"> met nummers </w:t>
-      </w:r>
-      <w:r>
-        <w:t xml:space="preserve">in de webpagina te verwerken. Daaronder heb ik de filmpjes toegevoegd, omdat er een restrictie was voor beeldmateriaal en ik nog leuke filmpjes had om te gebruiken. </w:t>
+        <w:t xml:space="preserve">maken, omdat hier veel javascript bij kwam kijken. </w:t>
       </w:r>
     </w:p>
     <w:p>
       <w:r>
-        <w:t xml:space="preserve">De CSS vond ik het moeilijkst, omdat ik daar het minst vertrouwd mee was en niet heel duidelijk wist wat ik wilde, </w:t>
-      </w:r>
-      <w:r>
-        <w:t xml:space="preserve">bijvoorbeeld of ik een afbeelding een absolute of relatieve positie moest geven. De moeilijkheid lag vooral bij het feit dat de webpagina moet werken bij verschillende schermgroottes. </w:t>
-      </w:r>
-      <w:r>
-        <w:t>Maar volgens mij is dat uiteindelijk met verschillende ‘</w:t>
+        <w:t>Bij luisteren</w:t>
+      </w:r>
+      <w:r>
+        <w:t>.html</w:t>
+      </w:r>
+      <w:r>
+        <w:t xml:space="preserve"> heb ik van </w:t>
       </w:r>
       <w:proofErr w:type="spellStart"/>
       <w:r>
-        <w:t>flex</w:t>
+        <w:t>S</w:t>
+      </w:r>
+      <w:r>
+        <w:t>potify</w:t>
       </w:r>
       <w:proofErr w:type="spellEnd"/>
       <w:r>
-        <w:t xml:space="preserve">’ onderdelen gelukt. </w:t>
+        <w:t xml:space="preserve"> code gebruikt en aangepast om de </w:t>
+      </w:r>
+      <w:proofErr w:type="spellStart"/>
+      <w:r>
+        <w:t>iframes</w:t>
+      </w:r>
+      <w:proofErr w:type="spellEnd"/>
+      <w:r>
+        <w:t xml:space="preserve"> met nummers </w:t>
+      </w:r>
+      <w:r>
+        <w:t xml:space="preserve">in de webpagina te verwerken. Daaronder heb ik filmpjes toegevoegd, omdat er een restrictie was voor beeldmateriaal en ik nog leuke filmpjes had om te gebruiken. </w:t>
       </w:r>
     </w:p>
     <w:p>
       <w:r>
-        <w:t xml:space="preserve">De </w:t>
+        <w:t xml:space="preserve">De CSS vond ik het moeilijkst, omdat ik daar het minst vertrouwd mee was en niet heel duidelijk wist wat ik wilde, </w:t>
+      </w:r>
+      <w:r>
+        <w:t xml:space="preserve">bijvoorbeeld of ik een afbeelding een absolute of relatieve positie moest geven. De moeilijkheid lag vooral bij het feit dat de webpagina moet werken bij verschillende schermgroottes. </w:t>
+      </w:r>
+      <w:r>
+        <w:t>Maar volgens mij is dat uiteindelijk met verschillende ‘</w:t>
       </w:r>
       <w:proofErr w:type="spellStart"/>
       <w:r>
-        <w:t>JavaScript</w:t>
+        <w:t>flex</w:t>
       </w:r>
       <w:proofErr w:type="spellEnd"/>
       <w:r>
-        <w:t xml:space="preserve"> vond ik ook niet makkelijk, maar ook niet moeilijk. Ik heb wel vaker al met python en een klein beetje met </w:t>
-      </w:r>
-      <w:proofErr w:type="spellStart"/>
-      <w:r>
-        <w:t>JavaScript</w:t>
-      </w:r>
-      <w:proofErr w:type="spellEnd"/>
-      <w:r>
-        <w:t xml:space="preserve"> gewerkt, dus de gedachtegang die je daarvoor nodig hebt, heb ik wel een beetje. Alleen soms de uitvoering is lastig, zeker omdat ik weet wat ik wil en hoe dat moet, maar je soms niet precies weet hoe je dat goed neergezet krijgt. </w:t>
+        <w:t xml:space="preserve">’ onderdelen gelukt. </w:t>
       </w:r>
     </w:p>
     <w:p>
       <w:r>
-        <w:t xml:space="preserve">Het zou dus kunnen dat ik overbodig moeilijke dingen heb gedaan voor een makkelijker probleem, maar ik heb het naar mijn idee simpel gehouden. </w:t>
-      </w:r>
-      <w:r>
-        <w:t xml:space="preserve">Er kunnen ook dus fouten inzitten, maar de code werkt en de webpagina doet het, dus voor mijn eerste echte webpagina ben ik tevreden. </w:t>
-      </w:r>
+        <w:t xml:space="preserve">De </w:t>
+      </w:r>
+      <w:proofErr w:type="spellStart"/>
+      <w:r>
+        <w:t>JavaScript</w:t>
+      </w:r>
+      <w:proofErr w:type="spellEnd"/>
+      <w:r>
+        <w:t xml:space="preserve"> vond ik ook niet makkelijk, maar ook niet moeilijk. Ik heb wel vaker al met python en een klein beetje met </w:t>
+      </w:r>
+      <w:proofErr w:type="spellStart"/>
+      <w:r>
+        <w:t>JavaScript</w:t>
+      </w:r>
+      <w:proofErr w:type="spellEnd"/>
+      <w:r>
+        <w:t xml:space="preserve"> gewerkt, dus de gedachtegang die je daarvoor nodig hebt, heb ik wel een beetje. Alleen soms de uitvoering is lastig, zeker omdat ik weet wat ik wil en hoe dat moet, maar je soms niet precies weet hoe je dat goed neergezet krijgt. </w:t>
+      </w:r>
+      <w:r>
+        <w:t xml:space="preserve">Ik heb </w:t>
+      </w:r>
+      <w:proofErr w:type="spellStart"/>
+      <w:r>
+        <w:t>JavaScript</w:t>
+      </w:r>
+      <w:proofErr w:type="spellEnd"/>
       <w:r>
         <w:t xml:space="preserve"> </w:t>
+      </w:r>
+      <w:r>
+        <w:t>gebruikt voor verschillende dingen: het inlogsysteem (</w:t>
+      </w:r>
+      <w:r>
+        <w:t xml:space="preserve">overigens het wachtwoord vermeld: </w:t>
+      </w:r>
+      <w:r>
+        <w:t>HobbieRico#2026</w:t>
+      </w:r>
+      <w:r>
+        <w:t>), het artikelen gebruik</w:t>
+      </w:r>
+      <w:r>
+        <w:t xml:space="preserve"> </w:t>
+      </w:r>
+      <w:r>
+        <w:t xml:space="preserve">en heb ik ervoor gezorgd dat als je een willekeurige </w:t>
+      </w:r>
+      <w:r>
+        <w:t xml:space="preserve">html opent, je altijd naar index wordt omgeleid, tenzij je daar al bent. </w:t>
+      </w:r>
+      <w:r>
+        <w:t xml:space="preserve">Ik heb hier dus wel veel gebruik gemaakt van verschillende bronnen, voor uitleg hoe ik bijvoorbeeld de </w:t>
+      </w:r>
+      <w:proofErr w:type="spellStart"/>
+      <w:r>
+        <w:t>hashing</w:t>
+      </w:r>
+      <w:proofErr w:type="spellEnd"/>
+      <w:r>
+        <w:t xml:space="preserve"> kon doen. </w:t>
       </w:r>
     </w:p>
     <w:p>
       <w:r>
-        <w:br w:type="page"/>
+        <w:t xml:space="preserve">Het zou dus kunnen dat ik overbodig moeilijke dingen heb gedaan voor een makkelijker probleem, maar ik heb het naar mijn idee simpel gehouden. </w:t>
+      </w:r>
+      <w:r>
+        <w:t xml:space="preserve">Er kunnen ook dus fouten inzitten, maar de code werkt en de webpagina doet het, dus voor mijn eerste echte webpagina ben ik tevreden. </w:t>
+      </w:r>
+      <w:r>
+        <w:t xml:space="preserve"> </w:t>
       </w:r>
     </w:p>
     <w:p>
+      <w:r>
+        <w:br w:type="page"/>
+      </w:r>
+    </w:p>
+    <w:p>
       <w:pPr>
         <w:pStyle w:val="Kop1"/>
       </w:pPr>
+      <w:bookmarkStart w:id="2" w:name="_Toc231684467"/>
       <w:r>
         <w:lastRenderedPageBreak/>
         <w:t>Hulpmiddelen</w:t>
       </w:r>
+      <w:bookmarkEnd w:id="2"/>
     </w:p>
     <w:p>
       <w:r>
@@ -577,6 +800,7 @@
         <w:docPartUnique/>
       </w:docPartObj>
     </w:sdtPr>
+    <w:sdtEndPr/>
     <w:sdtContent>
       <w:p>
         <w:pPr>

</xml_diff>